<commit_message>
Refine Lab pact document layout
</commit_message>
<xml_diff>
--- a/public/documents/Pacte_NewGbonhi_Lab.docx
+++ b/public/documents/Pacte_NewGbonhi_Lab.docx
@@ -722,11 +722,11 @@
     </w:p>
     <w:tbl>
       <w:tblPr>
-        <w:tblW w:type="dxa" w:w="9360"/>
-        <w:jc w:val="center"/>
+        <w:tblW w:type="dxa" w:w="8424"/>
         <w:tblLayout w:type="fixed"/>
         <w:tblLook w:firstColumn="1" w:firstRow="1" w:lastColumn="0" w:lastRow="0" w:noHBand="0" w:noVBand="1" w:val="04A0"/>
-        <w:tblInd w:w="120" w:type="dxa"/>
+        <w:jc w:val="center"/>
+        <w:tblInd w:w="0" w:type="dxa"/>
         <w:tblBorders>
           <w:top w:val="single" w:sz="6" w:space="0" w:color="E6E3DC"/>
           <w:left w:val="single" w:sz="6" w:space="0" w:color="E6E3DC"/>
@@ -737,13 +737,13 @@
         </w:tblBorders>
       </w:tblPr>
       <w:tblGrid>
-        <w:gridCol w:w="1701"/>
-        <w:gridCol w:w="7659"/>
+        <w:gridCol w:w="1872"/>
+        <w:gridCol w:w="6552"/>
       </w:tblGrid>
       <w:tr>
         <w:tc>
           <w:tcPr>
-            <w:tcW w:type="dxa" w:w="1701"/>
+            <w:tcW w:type="dxa" w:w="1872"/>
             <w:tcMar>
               <w:top w:w="120" w:type="dxa"/>
               <w:start w:w="140" w:type="dxa"/>
@@ -769,7 +769,7 @@
         </w:tc>
         <w:tc>
           <w:tcPr>
-            <w:tcW w:type="dxa" w:w="7659"/>
+            <w:tcW w:type="dxa" w:w="6552"/>
             <w:tcMar>
               <w:top w:w="120" w:type="dxa"/>
               <w:start w:w="140" w:type="dxa"/>
@@ -799,7 +799,7 @@
       <w:tr>
         <w:tc>
           <w:tcPr>
-            <w:tcW w:type="dxa" w:w="1701"/>
+            <w:tcW w:type="dxa" w:w="1872"/>
             <w:tcMar>
               <w:top w:w="120" w:type="dxa"/>
               <w:start w:w="140" w:type="dxa"/>
@@ -825,7 +825,7 @@
         </w:tc>
         <w:tc>
           <w:tcPr>
-            <w:tcW w:type="dxa" w:w="7659"/>
+            <w:tcW w:type="dxa" w:w="6552"/>
             <w:tcMar>
               <w:top w:w="120" w:type="dxa"/>
               <w:start w:w="140" w:type="dxa"/>
@@ -1082,11 +1082,11 @@
     </w:p>
     <w:tbl>
       <w:tblPr>
-        <w:tblW w:type="dxa" w:w="9360"/>
-        <w:jc w:val="center"/>
+        <w:tblW w:type="dxa" w:w="8424"/>
         <w:tblLayout w:type="fixed"/>
         <w:tblLook w:firstColumn="1" w:firstRow="1" w:lastColumn="0" w:lastRow="0" w:noHBand="0" w:noVBand="1" w:val="04A0"/>
-        <w:tblInd w:w="120" w:type="dxa"/>
+        <w:jc w:val="center"/>
+        <w:tblInd w:w="0" w:type="dxa"/>
         <w:tblBorders>
           <w:top w:val="single" w:sz="6" w:space="0" w:color="E6E3DC"/>
           <w:left w:val="single" w:sz="6" w:space="0" w:color="E6E3DC"/>
@@ -1097,13 +1097,13 @@
         </w:tblBorders>
       </w:tblPr>
       <w:tblGrid>
-        <w:gridCol w:w="1701"/>
-        <w:gridCol w:w="7659"/>
+        <w:gridCol w:w="1872"/>
+        <w:gridCol w:w="6552"/>
       </w:tblGrid>
       <w:tr>
         <w:tc>
           <w:tcPr>
-            <w:tcW w:type="dxa" w:w="1701"/>
+            <w:tcW w:type="dxa" w:w="1872"/>
             <w:tcMar>
               <w:top w:w="120" w:type="dxa"/>
               <w:start w:w="140" w:type="dxa"/>
@@ -1129,7 +1129,7 @@
         </w:tc>
         <w:tc>
           <w:tcPr>
-            <w:tcW w:type="dxa" w:w="7659"/>
+            <w:tcW w:type="dxa" w:w="6552"/>
             <w:tcMar>
               <w:top w:w="120" w:type="dxa"/>
               <w:start w:w="140" w:type="dxa"/>
@@ -1159,7 +1159,7 @@
       <w:tr>
         <w:tc>
           <w:tcPr>
-            <w:tcW w:type="dxa" w:w="1701"/>
+            <w:tcW w:type="dxa" w:w="1872"/>
             <w:tcMar>
               <w:top w:w="120" w:type="dxa"/>
               <w:start w:w="140" w:type="dxa"/>
@@ -1185,7 +1185,7 @@
         </w:tc>
         <w:tc>
           <w:tcPr>
-            <w:tcW w:type="dxa" w:w="7659"/>
+            <w:tcW w:type="dxa" w:w="6552"/>
             <w:tcMar>
               <w:top w:w="120" w:type="dxa"/>
               <w:start w:w="140" w:type="dxa"/>
@@ -1215,7 +1215,7 @@
       <w:tr>
         <w:tc>
           <w:tcPr>
-            <w:tcW w:type="dxa" w:w="1701"/>
+            <w:tcW w:type="dxa" w:w="1872"/>
             <w:tcMar>
               <w:top w:w="120" w:type="dxa"/>
               <w:start w:w="140" w:type="dxa"/>
@@ -1241,7 +1241,7 @@
         </w:tc>
         <w:tc>
           <w:tcPr>
-            <w:tcW w:type="dxa" w:w="7659"/>
+            <w:tcW w:type="dxa" w:w="6552"/>
             <w:tcMar>
               <w:top w:w="120" w:type="dxa"/>
               <w:start w:w="140" w:type="dxa"/>
@@ -1451,11 +1451,11 @@
     </w:p>
     <w:tbl>
       <w:tblPr>
-        <w:tblW w:type="dxa" w:w="9360"/>
-        <w:jc w:val="center"/>
+        <w:tblW w:type="dxa" w:w="8424"/>
         <w:tblLayout w:type="fixed"/>
         <w:tblLook w:firstColumn="1" w:firstRow="1" w:lastColumn="0" w:lastRow="0" w:noHBand="0" w:noVBand="1" w:val="04A0"/>
-        <w:tblInd w:w="120" w:type="dxa"/>
+        <w:jc w:val="center"/>
+        <w:tblInd w:w="0" w:type="dxa"/>
         <w:tblBorders>
           <w:top w:val="single" w:sz="6" w:space="0" w:color="E6E3DC"/>
           <w:left w:val="single" w:sz="6" w:space="0" w:color="E6E3DC"/>
@@ -1466,13 +1466,13 @@
         </w:tblBorders>
       </w:tblPr>
       <w:tblGrid>
-        <w:gridCol w:w="1701"/>
-        <w:gridCol w:w="7659"/>
+        <w:gridCol w:w="1872"/>
+        <w:gridCol w:w="6552"/>
       </w:tblGrid>
       <w:tr>
         <w:tc>
           <w:tcPr>
-            <w:tcW w:type="dxa" w:w="1701"/>
+            <w:tcW w:type="dxa" w:w="1872"/>
             <w:tcMar>
               <w:top w:w="120" w:type="dxa"/>
               <w:start w:w="140" w:type="dxa"/>
@@ -1498,7 +1498,7 @@
         </w:tc>
         <w:tc>
           <w:tcPr>
-            <w:tcW w:type="dxa" w:w="7659"/>
+            <w:tcW w:type="dxa" w:w="6552"/>
             <w:tcMar>
               <w:top w:w="120" w:type="dxa"/>
               <w:start w:w="140" w:type="dxa"/>
@@ -1528,7 +1528,7 @@
       <w:tr>
         <w:tc>
           <w:tcPr>
-            <w:tcW w:type="dxa" w:w="1701"/>
+            <w:tcW w:type="dxa" w:w="1872"/>
             <w:tcMar>
               <w:top w:w="120" w:type="dxa"/>
               <w:start w:w="140" w:type="dxa"/>
@@ -1554,7 +1554,7 @@
         </w:tc>
         <w:tc>
           <w:tcPr>
-            <w:tcW w:type="dxa" w:w="7659"/>
+            <w:tcW w:type="dxa" w:w="6552"/>
             <w:tcMar>
               <w:top w:w="120" w:type="dxa"/>
               <w:start w:w="140" w:type="dxa"/>
@@ -1584,7 +1584,7 @@
       <w:tr>
         <w:tc>
           <w:tcPr>
-            <w:tcW w:type="dxa" w:w="1701"/>
+            <w:tcW w:type="dxa" w:w="1872"/>
             <w:tcMar>
               <w:top w:w="120" w:type="dxa"/>
               <w:start w:w="140" w:type="dxa"/>
@@ -1610,7 +1610,7 @@
         </w:tc>
         <w:tc>
           <w:tcPr>
-            <w:tcW w:type="dxa" w:w="7659"/>
+            <w:tcW w:type="dxa" w:w="6552"/>
             <w:tcMar>
               <w:top w:w="120" w:type="dxa"/>
               <w:start w:w="140" w:type="dxa"/>
@@ -1640,7 +1640,7 @@
       <w:tr>
         <w:tc>
           <w:tcPr>
-            <w:tcW w:type="dxa" w:w="1701"/>
+            <w:tcW w:type="dxa" w:w="1872"/>
             <w:tcMar>
               <w:top w:w="120" w:type="dxa"/>
               <w:start w:w="140" w:type="dxa"/>
@@ -1666,7 +1666,7 @@
         </w:tc>
         <w:tc>
           <w:tcPr>
-            <w:tcW w:type="dxa" w:w="7659"/>
+            <w:tcW w:type="dxa" w:w="6552"/>
             <w:tcMar>
               <w:top w:w="120" w:type="dxa"/>
               <w:start w:w="140" w:type="dxa"/>
@@ -1696,7 +1696,7 @@
       <w:tr>
         <w:tc>
           <w:tcPr>
-            <w:tcW w:type="dxa" w:w="1701"/>
+            <w:tcW w:type="dxa" w:w="1872"/>
             <w:tcMar>
               <w:top w:w="120" w:type="dxa"/>
               <w:start w:w="140" w:type="dxa"/>
@@ -1722,7 +1722,7 @@
         </w:tc>
         <w:tc>
           <w:tcPr>
-            <w:tcW w:type="dxa" w:w="7659"/>
+            <w:tcW w:type="dxa" w:w="6552"/>
             <w:tcMar>
               <w:top w:w="120" w:type="dxa"/>
               <w:start w:w="140" w:type="dxa"/>
@@ -1752,7 +1752,7 @@
       <w:tr>
         <w:tc>
           <w:tcPr>
-            <w:tcW w:type="dxa" w:w="1701"/>
+            <w:tcW w:type="dxa" w:w="1872"/>
             <w:tcMar>
               <w:top w:w="120" w:type="dxa"/>
               <w:start w:w="140" w:type="dxa"/>
@@ -1778,7 +1778,7 @@
         </w:tc>
         <w:tc>
           <w:tcPr>
-            <w:tcW w:type="dxa" w:w="7659"/>
+            <w:tcW w:type="dxa" w:w="6552"/>
             <w:tcMar>
               <w:top w:w="120" w:type="dxa"/>
               <w:start w:w="140" w:type="dxa"/>
@@ -2369,11 +2369,11 @@
     </w:p>
     <w:tbl>
       <w:tblPr>
-        <w:tblW w:type="dxa" w:w="9360"/>
-        <w:jc w:val="center"/>
+        <w:tblW w:type="dxa" w:w="8424"/>
         <w:tblLayout w:type="fixed"/>
         <w:tblLook w:firstColumn="1" w:firstRow="1" w:lastColumn="0" w:lastRow="0" w:noHBand="0" w:noVBand="1" w:val="04A0"/>
-        <w:tblInd w:w="120" w:type="dxa"/>
+        <w:jc w:val="center"/>
+        <w:tblInd w:w="0" w:type="dxa"/>
         <w:tblBorders>
           <w:top w:val="single" w:sz="6" w:space="0" w:color="E6E3DC"/>
           <w:left w:val="single" w:sz="6" w:space="0" w:color="E6E3DC"/>
@@ -2384,13 +2384,13 @@
         </w:tblBorders>
       </w:tblPr>
       <w:tblGrid>
-        <w:gridCol w:w="1701"/>
-        <w:gridCol w:w="7659"/>
+        <w:gridCol w:w="1872"/>
+        <w:gridCol w:w="6552"/>
       </w:tblGrid>
       <w:tr>
         <w:tc>
           <w:tcPr>
-            <w:tcW w:type="dxa" w:w="1701"/>
+            <w:tcW w:type="dxa" w:w="1872"/>
             <w:tcMar>
               <w:top w:w="120" w:type="dxa"/>
               <w:start w:w="140" w:type="dxa"/>
@@ -2416,7 +2416,7 @@
         </w:tc>
         <w:tc>
           <w:tcPr>
-            <w:tcW w:type="dxa" w:w="7659"/>
+            <w:tcW w:type="dxa" w:w="6552"/>
             <w:tcMar>
               <w:top w:w="120" w:type="dxa"/>
               <w:start w:w="140" w:type="dxa"/>
@@ -2446,7 +2446,7 @@
       <w:tr>
         <w:tc>
           <w:tcPr>
-            <w:tcW w:type="dxa" w:w="1701"/>
+            <w:tcW w:type="dxa" w:w="1872"/>
             <w:tcMar>
               <w:top w:w="120" w:type="dxa"/>
               <w:start w:w="140" w:type="dxa"/>
@@ -2472,7 +2472,7 @@
         </w:tc>
         <w:tc>
           <w:tcPr>
-            <w:tcW w:type="dxa" w:w="7659"/>
+            <w:tcW w:type="dxa" w:w="6552"/>
             <w:tcMar>
               <w:top w:w="120" w:type="dxa"/>
               <w:start w:w="140" w:type="dxa"/>
@@ -2502,7 +2502,7 @@
       <w:tr>
         <w:tc>
           <w:tcPr>
-            <w:tcW w:type="dxa" w:w="1701"/>
+            <w:tcW w:type="dxa" w:w="1872"/>
             <w:tcMar>
               <w:top w:w="120" w:type="dxa"/>
               <w:start w:w="140" w:type="dxa"/>
@@ -2528,7 +2528,7 @@
         </w:tc>
         <w:tc>
           <w:tcPr>
-            <w:tcW w:type="dxa" w:w="7659"/>
+            <w:tcW w:type="dxa" w:w="6552"/>
             <w:tcMar>
               <w:top w:w="120" w:type="dxa"/>
               <w:start w:w="140" w:type="dxa"/>
@@ -2558,7 +2558,7 @@
       <w:tr>
         <w:tc>
           <w:tcPr>
-            <w:tcW w:type="dxa" w:w="1701"/>
+            <w:tcW w:type="dxa" w:w="1872"/>
             <w:tcMar>
               <w:top w:w="120" w:type="dxa"/>
               <w:start w:w="140" w:type="dxa"/>
@@ -2584,7 +2584,7 @@
         </w:tc>
         <w:tc>
           <w:tcPr>
-            <w:tcW w:type="dxa" w:w="7659"/>
+            <w:tcW w:type="dxa" w:w="6552"/>
             <w:tcMar>
               <w:top w:w="120" w:type="dxa"/>
               <w:start w:w="140" w:type="dxa"/>
@@ -2614,7 +2614,7 @@
       <w:tr>
         <w:tc>
           <w:tcPr>
-            <w:tcW w:type="dxa" w:w="1701"/>
+            <w:tcW w:type="dxa" w:w="1872"/>
             <w:tcMar>
               <w:top w:w="120" w:type="dxa"/>
               <w:start w:w="140" w:type="dxa"/>
@@ -2640,7 +2640,7 @@
         </w:tc>
         <w:tc>
           <w:tcPr>
-            <w:tcW w:type="dxa" w:w="7659"/>
+            <w:tcW w:type="dxa" w:w="6552"/>
             <w:tcMar>
               <w:top w:w="120" w:type="dxa"/>
               <w:start w:w="140" w:type="dxa"/>
@@ -2910,11 +2910,11 @@
     </w:p>
     <w:tbl>
       <w:tblPr>
-        <w:tblW w:type="dxa" w:w="9360"/>
-        <w:jc w:val="center"/>
+        <w:tblW w:type="dxa" w:w="8424"/>
         <w:tblLayout w:type="fixed"/>
         <w:tblLook w:firstColumn="1" w:firstRow="1" w:lastColumn="0" w:lastRow="0" w:noHBand="0" w:noVBand="1" w:val="04A0"/>
-        <w:tblInd w:w="120" w:type="dxa"/>
+        <w:jc w:val="center"/>
+        <w:tblInd w:w="0" w:type="dxa"/>
         <w:tblBorders>
           <w:top w:val="single" w:sz="6" w:space="0" w:color="E6E3DC"/>
           <w:left w:val="single" w:sz="6" w:space="0" w:color="E6E3DC"/>
@@ -2925,13 +2925,13 @@
         </w:tblBorders>
       </w:tblPr>
       <w:tblGrid>
-        <w:gridCol w:w="1701"/>
-        <w:gridCol w:w="7659"/>
+        <w:gridCol w:w="1872"/>
+        <w:gridCol w:w="6552"/>
       </w:tblGrid>
       <w:tr>
         <w:tc>
           <w:tcPr>
-            <w:tcW w:type="dxa" w:w="1701"/>
+            <w:tcW w:type="dxa" w:w="1872"/>
             <w:tcMar>
               <w:top w:w="120" w:type="dxa"/>
               <w:start w:w="140" w:type="dxa"/>
@@ -2957,7 +2957,7 @@
         </w:tc>
         <w:tc>
           <w:tcPr>
-            <w:tcW w:type="dxa" w:w="7659"/>
+            <w:tcW w:type="dxa" w:w="6552"/>
             <w:tcMar>
               <w:top w:w="120" w:type="dxa"/>
               <w:start w:w="140" w:type="dxa"/>
@@ -2987,7 +2987,7 @@
       <w:tr>
         <w:tc>
           <w:tcPr>
-            <w:tcW w:type="dxa" w:w="1701"/>
+            <w:tcW w:type="dxa" w:w="1872"/>
             <w:tcMar>
               <w:top w:w="120" w:type="dxa"/>
               <w:start w:w="140" w:type="dxa"/>
@@ -3013,7 +3013,7 @@
         </w:tc>
         <w:tc>
           <w:tcPr>
-            <w:tcW w:type="dxa" w:w="7659"/>
+            <w:tcW w:type="dxa" w:w="6552"/>
             <w:tcMar>
               <w:top w:w="120" w:type="dxa"/>
               <w:start w:w="140" w:type="dxa"/>
@@ -3043,7 +3043,7 @@
       <w:tr>
         <w:tc>
           <w:tcPr>
-            <w:tcW w:type="dxa" w:w="1701"/>
+            <w:tcW w:type="dxa" w:w="1872"/>
             <w:tcMar>
               <w:top w:w="120" w:type="dxa"/>
               <w:start w:w="140" w:type="dxa"/>
@@ -3069,7 +3069,7 @@
         </w:tc>
         <w:tc>
           <w:tcPr>
-            <w:tcW w:type="dxa" w:w="7659"/>
+            <w:tcW w:type="dxa" w:w="6552"/>
             <w:tcMar>
               <w:top w:w="120" w:type="dxa"/>
               <w:start w:w="140" w:type="dxa"/>
@@ -3099,7 +3099,7 @@
       <w:tr>
         <w:tc>
           <w:tcPr>
-            <w:tcW w:type="dxa" w:w="1701"/>
+            <w:tcW w:type="dxa" w:w="1872"/>
             <w:tcMar>
               <w:top w:w="120" w:type="dxa"/>
               <w:start w:w="140" w:type="dxa"/>
@@ -3125,7 +3125,7 @@
         </w:tc>
         <w:tc>
           <w:tcPr>
-            <w:tcW w:type="dxa" w:w="7659"/>
+            <w:tcW w:type="dxa" w:w="6552"/>
             <w:tcMar>
               <w:top w:w="120" w:type="dxa"/>
               <w:start w:w="140" w:type="dxa"/>
@@ -3155,7 +3155,7 @@
       <w:tr>
         <w:tc>
           <w:tcPr>
-            <w:tcW w:type="dxa" w:w="1701"/>
+            <w:tcW w:type="dxa" w:w="1872"/>
             <w:tcMar>
               <w:top w:w="120" w:type="dxa"/>
               <w:start w:w="140" w:type="dxa"/>
@@ -3181,7 +3181,7 @@
         </w:tc>
         <w:tc>
           <w:tcPr>
-            <w:tcW w:type="dxa" w:w="7659"/>
+            <w:tcW w:type="dxa" w:w="6552"/>
             <w:tcMar>
               <w:top w:w="120" w:type="dxa"/>
               <w:start w:w="140" w:type="dxa"/>
@@ -3211,7 +3211,7 @@
       <w:tr>
         <w:tc>
           <w:tcPr>
-            <w:tcW w:type="dxa" w:w="1701"/>
+            <w:tcW w:type="dxa" w:w="1872"/>
             <w:tcMar>
               <w:top w:w="120" w:type="dxa"/>
               <w:start w:w="140" w:type="dxa"/>
@@ -3237,7 +3237,7 @@
         </w:tc>
         <w:tc>
           <w:tcPr>
-            <w:tcW w:type="dxa" w:w="7659"/>
+            <w:tcW w:type="dxa" w:w="6552"/>
             <w:tcMar>
               <w:top w:w="120" w:type="dxa"/>
               <w:start w:w="140" w:type="dxa"/>
@@ -3267,7 +3267,7 @@
       <w:tr>
         <w:tc>
           <w:tcPr>
-            <w:tcW w:type="dxa" w:w="1701"/>
+            <w:tcW w:type="dxa" w:w="1872"/>
             <w:tcMar>
               <w:top w:w="120" w:type="dxa"/>
               <w:start w:w="140" w:type="dxa"/>
@@ -3293,7 +3293,7 @@
         </w:tc>
         <w:tc>
           <w:tcPr>
-            <w:tcW w:type="dxa" w:w="7659"/>
+            <w:tcW w:type="dxa" w:w="6552"/>
             <w:tcMar>
               <w:top w:w="120" w:type="dxa"/>
               <w:start w:w="140" w:type="dxa"/>
@@ -3323,7 +3323,7 @@
       <w:tr>
         <w:tc>
           <w:tcPr>
-            <w:tcW w:type="dxa" w:w="1701"/>
+            <w:tcW w:type="dxa" w:w="1872"/>
             <w:tcMar>
               <w:top w:w="120" w:type="dxa"/>
               <w:start w:w="140" w:type="dxa"/>
@@ -3349,7 +3349,7 @@
         </w:tc>
         <w:tc>
           <w:tcPr>
-            <w:tcW w:type="dxa" w:w="7659"/>
+            <w:tcW w:type="dxa" w:w="6552"/>
             <w:tcMar>
               <w:top w:w="120" w:type="dxa"/>
               <w:start w:w="140" w:type="dxa"/>
@@ -3379,7 +3379,7 @@
       <w:tr>
         <w:tc>
           <w:tcPr>
-            <w:tcW w:type="dxa" w:w="1701"/>
+            <w:tcW w:type="dxa" w:w="1872"/>
             <w:tcMar>
               <w:top w:w="120" w:type="dxa"/>
               <w:start w:w="140" w:type="dxa"/>
@@ -3405,7 +3405,7 @@
         </w:tc>
         <w:tc>
           <w:tcPr>
-            <w:tcW w:type="dxa" w:w="7659"/>
+            <w:tcW w:type="dxa" w:w="6552"/>
             <w:tcMar>
               <w:top w:w="120" w:type="dxa"/>
               <w:start w:w="140" w:type="dxa"/>
@@ -3435,7 +3435,7 @@
       <w:tr>
         <w:tc>
           <w:tcPr>
-            <w:tcW w:type="dxa" w:w="1701"/>
+            <w:tcW w:type="dxa" w:w="1872"/>
             <w:tcMar>
               <w:top w:w="120" w:type="dxa"/>
               <w:start w:w="140" w:type="dxa"/>
@@ -3461,7 +3461,7 @@
         </w:tc>
         <w:tc>
           <w:tcPr>
-            <w:tcW w:type="dxa" w:w="7659"/>
+            <w:tcW w:type="dxa" w:w="6552"/>
             <w:tcMar>
               <w:top w:w="120" w:type="dxa"/>
               <w:start w:w="140" w:type="dxa"/>
@@ -3491,7 +3491,7 @@
       <w:tr>
         <w:tc>
           <w:tcPr>
-            <w:tcW w:type="dxa" w:w="1701"/>
+            <w:tcW w:type="dxa" w:w="1872"/>
             <w:tcMar>
               <w:top w:w="120" w:type="dxa"/>
               <w:start w:w="140" w:type="dxa"/>
@@ -3517,7 +3517,7 @@
         </w:tc>
         <w:tc>
           <w:tcPr>
-            <w:tcW w:type="dxa" w:w="7659"/>
+            <w:tcW w:type="dxa" w:w="6552"/>
             <w:tcMar>
               <w:top w:w="120" w:type="dxa"/>
               <w:start w:w="140" w:type="dxa"/>
@@ -3547,7 +3547,7 @@
       <w:tr>
         <w:tc>
           <w:tcPr>
-            <w:tcW w:type="dxa" w:w="1701"/>
+            <w:tcW w:type="dxa" w:w="1872"/>
             <w:tcMar>
               <w:top w:w="120" w:type="dxa"/>
               <w:start w:w="140" w:type="dxa"/>
@@ -3573,7 +3573,7 @@
         </w:tc>
         <w:tc>
           <w:tcPr>
-            <w:tcW w:type="dxa" w:w="7659"/>
+            <w:tcW w:type="dxa" w:w="6552"/>
             <w:tcMar>
               <w:top w:w="120" w:type="dxa"/>
               <w:start w:w="140" w:type="dxa"/>
@@ -3603,7 +3603,7 @@
       <w:tr>
         <w:tc>
           <w:tcPr>
-            <w:tcW w:type="dxa" w:w="1701"/>
+            <w:tcW w:type="dxa" w:w="1872"/>
             <w:tcMar>
               <w:top w:w="120" w:type="dxa"/>
               <w:start w:w="140" w:type="dxa"/>
@@ -3629,7 +3629,7 @@
         </w:tc>
         <w:tc>
           <w:tcPr>
-            <w:tcW w:type="dxa" w:w="7659"/>
+            <w:tcW w:type="dxa" w:w="6552"/>
             <w:tcMar>
               <w:top w:w="120" w:type="dxa"/>
               <w:start w:w="140" w:type="dxa"/>

</xml_diff>